<commit_message>
docs: ajusta Pessoa, Pessoa Física e Pessoa Jurídica como tipos de Pessoa no glossário. Issue #80
</commit_message>
<xml_diff>
--- a/Requisitos/Documentos de Casos de Uso/Glossário-ImovelJa.docx
+++ b/Requisitos/Documentos de Casos de Uso/Glossário-ImovelJa.docx
@@ -20,7 +20,6 @@
         </w:rPr>
         <w:t xml:space="preserve">Glossário: </w:t>
       </w:r>
-      <w:proofErr w:type="spellStart"/>
       <w:r>
         <w:rPr>
           <w:b/>
@@ -30,7 +29,6 @@
         </w:rPr>
         <w:t>ImóvelJá</w:t>
       </w:r>
-      <w:proofErr w:type="spellEnd"/>
     </w:p>
     <w:p>
       <w:pPr>
@@ -414,23 +412,7 @@
                 <w:sz w:val="28"/>
                 <w:szCs w:val="28"/>
               </w:rPr>
-              <w:t xml:space="preserve">Registro de um pagamento mensal de aluguel, com valor pago, data e status (Pendente, </w:t>
-            </w:r>
-            <w:proofErr w:type="gramStart"/>
-            <w:r>
-              <w:rPr>
-                <w:sz w:val="28"/>
-                <w:szCs w:val="28"/>
-              </w:rPr>
-              <w:t>Em</w:t>
-            </w:r>
-            <w:proofErr w:type="gramEnd"/>
-            <w:r>
-              <w:rPr>
-                <w:sz w:val="28"/>
-                <w:szCs w:val="28"/>
-              </w:rPr>
-              <w:t xml:space="preserve"> atraso ou Pago).</w:t>
+              <w:t xml:space="preserve">Registro de um pagamento mensal de aluguel, com valor pago, data e status (Pendente, Em atraso ou Pago).</w:t>
             </w:r>
           </w:p>
         </w:tc>
@@ -650,7 +632,7 @@
                 <w:sz w:val="28"/>
                 <w:szCs w:val="28"/>
               </w:rPr>
-              <w:t>Superclasse que representa qualquer pessoa (física ou jurídica) cadastrada na plataforma, com dados comuns como nome e e-mail. Especializa-se em Pessoa Física ou Pessoa Jurídica conforme o tipo de cadastro.</w:t>
+              <w:t>Qualquer pessoa cadastrada na plataforma, com dados como nome, e-mail e telefone. O tipo de cadastro indica se é Pessoa Física ou Pessoa Jurídica e define os dados obrigatórios.</w:t>
             </w:r>
           </w:p>
         </w:tc>
@@ -694,7 +676,7 @@
                 <w:sz w:val="28"/>
                 <w:szCs w:val="28"/>
               </w:rPr>
-              <w:t>Especialização de Pessoa para cadastros individuais, identificados por CPF, com data de nascimento.</w:t>
+              <w:t>Tipo de Pessoa para cadastros individuais, identificados por CPF, com data de nascimento.</w:t>
             </w:r>
           </w:p>
         </w:tc>
@@ -738,7 +720,7 @@
                 <w:sz w:val="28"/>
                 <w:szCs w:val="28"/>
               </w:rPr>
-              <w:t>Especialização de Pessoa para cadastros de empresas, identificados por CNPJ.</w:t>
+              <w:t>Tipo de Pessoa para cadastros de empresas, identificados por CNPJ.</w:t>
             </w:r>
           </w:p>
         </w:tc>

</xml_diff>